<commit_message>
Sync experience, education, and skills with updated résumé
- Rebuild Experience & Education timeline: 4 real roles (Fusion Software Developer,
  Stackblocks MLOps, Honnex DevOps, Honnex Web Dev intern) + M.S. and B.Tech,
  reverse-chronological, with period-accurate tech per year
- Replace redundant skill buckets with: Generative AI & LLMs / Languages & Web /
  Cloud, DevOps & MLOps / Databases & Tools
- Update location to New Jersey, change stat to ~5yr experience, refresh hero/about copy
- Swap in updated downloadable .docx résumé

Co-Authored-By: Claude Opus 4.8 (1M context) <noreply@anthropic.com>
</commit_message>
<xml_diff>
--- a/Vishal_Yadav_Chatharasi_Resume.docx
+++ b/Vishal_Yadav_Chatharasi_Resume.docx
@@ -52,7 +52,7 @@
           <w:szCs w:val="21"/>
           <w:rtl w:val="0"/>
         </w:rPr>
-        <w:t xml:space="preserve"/>
+        <w:t xml:space="preserve">(216) 325-8442</w:t>
       </w:r>
       <w:r>
         <w:rPr>
@@ -81,7 +81,17 @@
           <w:vertAlign w:val="baseline"/>
           <w:rtl w:val="0"/>
         </w:rPr>
-        <w:t xml:space="preserve"> |</w:t>
+        <w:t xml:space="preserve"> | </w:t>
+      </w:r>
+      <w:r>
+        <w:rPr>
+          <w:rFonts w:ascii="Arial" w:cs="Arial" w:eastAsia="Arial" w:hAnsi="Arial"/>
+          <w:sz w:val="21"/>
+          <w:szCs w:val="21"/>
+          <w:vertAlign w:val="baseline"/>
+          <w:rtl w:val="0"/>
+        </w:rPr>
+        <w:t xml:space="preserve">New Jersey</w:t>
       </w:r>
     </w:p>
     <w:p>
@@ -128,7 +138,7 @@
           <w:szCs w:val="21"/>
           <w:rtl w:val="0"/>
         </w:rPr>
-        <w:t xml:space="preserve">github.com/vishalch4466</w:t>
+        <w:t xml:space="preserve">github.com/vishalch4466  |  www.vishalch.dev</w:t>
       </w:r>
     </w:p>
     <w:p>
@@ -237,7 +247,7 @@
           <w:szCs w:val="22"/>
           <w:rtl w:val="0"/>
         </w:rPr>
-        <w:t xml:space="preserve">Aspiring Generative AI Engineer with hands-on experience building LLM-powered applications and RAG systems. Proficient in working with OpenAI API, LangChain, and vector databases to create intelligent chatbots and document processing solutions. Skilled in prompt engineering, API integration, and deploying Gen AI applications on cloud platforms. Eager to apply knowledge of LLM technologies, RAG architecture, and modern development tools to build innovative AI solutions that solve real-world problems while continuously learning emerging Gen AI techniques and best practices.</w:t>
+        <w:t xml:space="preserve">Generative AI Engineer with ~5 years of experience building LLM-powered applications and RAG systems. Proficient in working with OpenAI API, LangChain, and vector databases to create intelligent chatbots and document processing solutions. Skilled in prompt engineering, API integration, and deploying Gen AI applications on cloud platforms. Eager to apply knowledge of LLM technologies, RAG architecture, and modern development tools to build innovative AI solutions that solve real-world problems while continuously learning emerging Gen AI techniques and best practices.</w:t>
       </w:r>
     </w:p>
     <w:p>
@@ -280,28 +290,239 @@
         <w:rPr>
           <w:rFonts w:ascii="Arial" w:cs="Arial" w:eastAsia="Arial" w:hAnsi="Arial"/>
           <w:b w:val="1"/>
+          <w:color w:val="404040"/>
           <w:sz w:val="22"/>
           <w:szCs w:val="22"/>
           <w:rtl w:val="0"/>
         </w:rPr>
-        <w:t xml:space="preserve">WORK EXPERIENCE</w:t>
-      </w:r>
-      <w:r>
-        <w:rPr>
-          <w:rtl w:val="0"/>
-        </w:rPr>
-      </w:r>
-    </w:p>
-    <w:p>
-      <w:pPr>
-        <w:tabs>
-          <w:tab w:val="left" w:leader="none" w:pos="284"/>
-          <w:tab w:val="left" w:leader="none" w:pos="630"/>
-          <w:tab w:val="left" w:leader="none" w:pos="900"/>
-        </w:tabs>
-        <w:rPr>
+        <w:t xml:space="preserve">TECHNICAL SKILLS</w:t>
+      </w:r>
+      <w:r>
+        <w:rPr>
+          <w:rtl w:val="0"/>
+        </w:rPr>
+      </w:r>
+    </w:p>
+    <w:p>
+      <w:pPr>
+        <w:keepNext w:val="1"/>
+        <w:widowControl w:val="0"/>
+        <w:tabs>
+          <w:tab w:val="left" w:leader="none" w:pos="630"/>
+          <w:tab w:val="left" w:leader="none" w:pos="900"/>
+        </w:tabs>
+        <w:spacing w:after="240" w:before="240" w:lineRule="auto"/>
+        <w:rPr>
+          <w:rFonts w:ascii="Arial" w:cs="Arial" w:eastAsia="Arial" w:hAnsi="Arial"/>
+          <w:sz w:val="21"/>
+          <w:szCs w:val="21"/>
+        </w:rPr>
+      </w:pPr>
+      <w:r>
+        <w:rPr>
+          <w:rFonts w:ascii="Arial" w:cs="Arial" w:eastAsia="Arial" w:hAnsi="Arial"/>
+          <w:b w:val="1"/>
+          <w:sz w:val="21"/>
+          <w:szCs w:val="21"/>
+          <w:rtl w:val="0"/>
+        </w:rPr>
+        <w:t xml:space="preserve">Generative AI &amp; LLMs:</w:t>
+      </w:r>
+      <w:r>
+        <w:rPr>
+          <w:rFonts w:ascii="Arial" w:cs="Arial" w:eastAsia="Arial" w:hAnsi="Arial"/>
+          <w:sz w:val="21"/>
+          <w:szCs w:val="21"/>
+          <w:rtl w:val="0"/>
+        </w:rPr>
+        <w:t xml:space="preserve"> GPT-4, GPT-3.5, Claude, OpenAI &amp; Claude APIs, RAG (Retrieval-Augmented Generation), Prompt Engineering, LangChain, Hugging Face, Vector Databases (Pinecone, Chroma, FAISS), Embeddings &amp; Semantic Search, AI Agents, Chatbots &amp; Q&amp;A Systems</w:t>
+      </w:r>
+    </w:p>
+    <w:p>
+      <w:pPr>
+        <w:keepNext w:val="1"/>
+        <w:widowControl w:val="0"/>
+        <w:tabs>
+          <w:tab w:val="left" w:leader="none" w:pos="630"/>
+          <w:tab w:val="left" w:leader="none" w:pos="900"/>
+        </w:tabs>
+        <w:spacing w:after="240" w:before="240" w:lineRule="auto"/>
+        <w:rPr>
+          <w:rFonts w:ascii="Arial" w:cs="Arial" w:eastAsia="Arial" w:hAnsi="Arial"/>
+          <w:sz w:val="21"/>
+          <w:szCs w:val="21"/>
+        </w:rPr>
+      </w:pPr>
+      <w:r>
+        <w:rPr>
+          <w:rFonts w:ascii="Arial" w:cs="Arial" w:eastAsia="Arial" w:hAnsi="Arial"/>
+          <w:b w:val="1"/>
+          <w:sz w:val="21"/>
+          <w:szCs w:val="21"/>
+          <w:rtl w:val="0"/>
+        </w:rPr>
+        <w:t xml:space="preserve">Languages &amp; Web:</w:t>
+      </w:r>
+      <w:r>
+        <w:rPr>
+          <w:rFonts w:ascii="Arial" w:cs="Arial" w:eastAsia="Arial" w:hAnsi="Arial"/>
+          <w:sz w:val="21"/>
+          <w:szCs w:val="21"/>
+          <w:rtl w:val="0"/>
+        </w:rPr>
+        <w:t xml:space="preserve"> Python, TypeScript, JavaScript (ES6+), SQL, HTML5/CSS3, React, Node.js, FastAPI, Streamlit, REST APIs</w:t>
+      </w:r>
+    </w:p>
+    <w:p>
+      <w:pPr>
+        <w:keepNext w:val="1"/>
+        <w:widowControl w:val="0"/>
+        <w:tabs>
+          <w:tab w:val="left" w:leader="none" w:pos="630"/>
+          <w:tab w:val="left" w:leader="none" w:pos="900"/>
+        </w:tabs>
+        <w:spacing w:after="240" w:before="240" w:lineRule="auto"/>
+        <w:rPr>
+          <w:rFonts w:ascii="Arial" w:cs="Arial" w:eastAsia="Arial" w:hAnsi="Arial"/>
+          <w:sz w:val="21"/>
+          <w:szCs w:val="21"/>
+        </w:rPr>
+      </w:pPr>
+      <w:r>
+        <w:rPr>
+          <w:rFonts w:ascii="Arial" w:cs="Arial" w:eastAsia="Arial" w:hAnsi="Arial"/>
+          <w:b w:val="1"/>
+          <w:sz w:val="21"/>
+          <w:szCs w:val="21"/>
+          <w:rtl w:val="0"/>
+        </w:rPr>
+        <w:t xml:space="preserve">Cloud, DevOps &amp; MLOps:</w:t>
+      </w:r>
+      <w:r>
+        <w:rPr>
+          <w:rFonts w:ascii="Arial" w:cs="Arial" w:eastAsia="Arial" w:hAnsi="Arial"/>
+          <w:sz w:val="21"/>
+          <w:szCs w:val="21"/>
+          <w:rtl w:val="0"/>
+        </w:rPr>
+        <w:t xml:space="preserve"> AWS (Lambda, S3, EC2, ECS), Google Cloud (Vertex AI), Docker, Kubernetes, CI/CD (Jenkins, GitHub Actions), Terraform, Ansible, MLflow, Airflow, Prometheus, Grafana</w:t>
+      </w:r>
+    </w:p>
+    <w:p>
+      <w:pPr>
+        <w:keepNext w:val="1"/>
+        <w:widowControl w:val="0"/>
+        <w:tabs>
+          <w:tab w:val="left" w:leader="none" w:pos="630"/>
+          <w:tab w:val="left" w:leader="none" w:pos="900"/>
+        </w:tabs>
+        <w:spacing w:after="240" w:before="240" w:lineRule="auto"/>
+        <w:rPr>
+          <w:rFonts w:ascii="Arial" w:cs="Arial" w:eastAsia="Arial" w:hAnsi="Arial"/>
+          <w:sz w:val="21"/>
+          <w:szCs w:val="21"/>
+        </w:rPr>
+      </w:pPr>
+      <w:r>
+        <w:rPr>
+          <w:rFonts w:ascii="Arial" w:cs="Arial" w:eastAsia="Arial" w:hAnsi="Arial"/>
+          <w:b w:val="1"/>
+          <w:sz w:val="21"/>
+          <w:szCs w:val="21"/>
+          <w:rtl w:val="0"/>
+        </w:rPr>
+        <w:t xml:space="preserve">Databases &amp; Tools:</w:t>
+      </w:r>
+      <w:r>
+        <w:rPr>
+          <w:rFonts w:ascii="Arial" w:cs="Arial" w:eastAsia="Arial" w:hAnsi="Arial"/>
+          <w:sz w:val="21"/>
+          <w:szCs w:val="21"/>
+          <w:rtl w:val="0"/>
+        </w:rPr>
+        <w:t xml:space="preserve"> PostgreSQL, MySQL, Supabase, Git &amp; GitHub, Jupyter Notebooks, Postman, VS Code, Agile/Scrum</w:t>
+      </w:r>
+    </w:p>
+    <w:p>
+      <w:pPr>
+        <w:keepNext w:val="1"/>
+        <w:widowControl w:val="0"/>
+        <w:tabs>
+          <w:tab w:val="left" w:leader="none" w:pos="630"/>
+          <w:tab w:val="left" w:leader="none" w:pos="900"/>
+        </w:tabs>
+        <w:spacing w:after="240" w:before="240" w:lineRule="auto"/>
+        <w:rPr>
+          <w:rFonts w:ascii="Arial" w:cs="Arial" w:eastAsia="Arial" w:hAnsi="Arial"/>
+          <w:b w:val="1"/>
+          <w:sz w:val="21"/>
+          <w:szCs w:val="21"/>
+        </w:rPr>
+      </w:pPr>
+      <w:r>
+        <w:rPr>
+          <w:rtl w:val="0"/>
+        </w:rPr>
+      </w:r>
+    </w:p>
+    <w:p>
+      <w:pPr>
+        <w:tabs>
+          <w:tab w:val="left" w:leader="none" w:pos="630"/>
+          <w:tab w:val="left" w:leader="none" w:pos="900"/>
+        </w:tabs>
+        <w:rPr>
+          <w:rFonts w:ascii="Arial" w:cs="Arial" w:eastAsia="Arial" w:hAnsi="Arial"/>
+          <w:sz w:val="21"/>
+          <w:szCs w:val="21"/>
+        </w:rPr>
+      </w:pPr>
+      <w:r>
+        <w:rPr>
+          <w:rtl w:val="0"/>
+        </w:rPr>
+      </w:r>
+    </w:p>
+    <w:p>
+      <w:pPr>
+        <w:pBdr>
+          <w:bottom w:color="000000" w:space="1" w:sz="6" w:val="single"/>
+        </w:pBdr>
+        <w:tabs>
+          <w:tab w:val="left" w:leader="none" w:pos="900"/>
+        </w:tabs>
+        <w:rPr>
+          <w:rFonts w:ascii="Arial" w:cs="Arial" w:eastAsia="Arial" w:hAnsi="Arial"/>
+          <w:sz w:val="21"/>
+          <w:szCs w:val="21"/>
+        </w:rPr>
+      </w:pPr>
+      <w:r>
+        <w:rPr>
+          <w:rFonts w:ascii="Arial" w:cs="Arial" w:eastAsia="Arial" w:hAnsi="Arial"/>
+          <w:b w:val="1"/>
           <w:sz w:val="22"/>
           <w:szCs w:val="22"/>
+          <w:rtl w:val="0"/>
+        </w:rPr>
+        <w:t xml:space="preserve">WORK EXPERIENCE</w:t>
+      </w:r>
+      <w:r>
+        <w:rPr>
+          <w:rtl w:val="0"/>
+        </w:rPr>
+      </w:r>
+    </w:p>
+    <w:p>
+      <w:pPr>
+        <w:tabs>
+          <w:tab w:val="left" w:leader="none" w:pos="900"/>
+          <w:tab w:val="right" w:leader="none" w:pos="10503"/>
+        </w:tabs>
+        <w:rPr>
+          <w:rFonts w:ascii="Arial" w:cs="Arial" w:eastAsia="Arial" w:hAnsi="Arial"/>
+          <w:sz w:val="21"/>
+          <w:szCs w:val="21"/>
         </w:rPr>
       </w:pPr>
       <w:r>
@@ -321,21 +542,17 @@
           <w:szCs w:val="21"/>
           <w:rtl w:val="0"/>
         </w:rPr>
-        <w:t xml:space="preserve">HONNEX SOFTWARE SOLUTIONS</w:t>
-      </w:r>
-      <w:r>
-        <w:rPr>
-          <w:rFonts w:ascii="Arial" w:cs="Arial" w:eastAsia="Arial" w:hAnsi="Arial"/>
-          <w:sz w:val="21"/>
-          <w:szCs w:val="21"/>
-          <w:rtl w:val="0"/>
-        </w:rPr>
-        <w:t xml:space="preserve">                                                                                             Hyderabad, IN</w:t>
-      </w:r>
-      <w:r>
-        <w:rPr>
-          <w:rtl w:val="0"/>
-        </w:rPr>
+        <w:t xml:space="preserve">FUSION IT TEK INC</w:t>
+      </w:r>
+      <w:r>
+        <w:rPr>
+          <w:rFonts w:ascii="Arial" w:cs="Arial" w:eastAsia="Arial" w:hAnsi="Arial"/>
+          <w:sz w:val="21"/>
+          <w:szCs w:val="21"/>
+          <w:rtl w:val="0"/>
+        </w:rPr>
+        <w:tab/>
+        <w:t xml:space="preserve">North Carolina</w:t>
       </w:r>
     </w:p>
     <w:p>
@@ -346,38 +563,19 @@
         </w:tabs>
         <w:rPr>
           <w:rFonts w:ascii="Arial" w:cs="Arial" w:eastAsia="Arial" w:hAnsi="Arial"/>
-          <w:b w:val="1"/>
-          <w:sz w:val="21"/>
-          <w:szCs w:val="21"/>
-        </w:rPr>
-      </w:pPr>
-      <w:r>
-        <w:rPr>
-          <w:rtl w:val="0"/>
-        </w:rPr>
-      </w:r>
-    </w:p>
-    <w:p>
-      <w:pPr>
-        <w:tabs>
-          <w:tab w:val="left" w:leader="none" w:pos="1134"/>
-          <w:tab w:val="right" w:leader="none" w:pos="10503"/>
-        </w:tabs>
-        <w:rPr>
-          <w:rFonts w:ascii="Arial" w:cs="Arial" w:eastAsia="Arial" w:hAnsi="Arial"/>
-          <w:sz w:val="21"/>
-          <w:szCs w:val="21"/>
-        </w:rPr>
-      </w:pPr>
-      <w:r>
-        <w:rPr>
-          <w:rFonts w:ascii="Arial" w:cs="Arial" w:eastAsia="Arial" w:hAnsi="Arial"/>
-          <w:b w:val="1"/>
-          <w:sz w:val="21"/>
-          <w:szCs w:val="21"/>
-          <w:rtl w:val="0"/>
-        </w:rPr>
-        <w:t xml:space="preserve"> Generative AI/ML Intern  </w:t>
+          <w:sz w:val="21"/>
+          <w:szCs w:val="21"/>
+        </w:rPr>
+      </w:pPr>
+      <w:r>
+        <w:rPr>
+          <w:rFonts w:ascii="Arial" w:cs="Arial" w:eastAsia="Arial" w:hAnsi="Arial"/>
+          <w:b w:val="1"/>
+          <w:sz w:val="21"/>
+          <w:szCs w:val="21"/>
+          <w:rtl w:val="0"/>
+        </w:rPr>
+        <w:t xml:space="preserve">Software Developer</w:t>
       </w:r>
       <w:r>
         <w:rPr>
@@ -387,7 +585,7 @@
           <w:rtl w:val="0"/>
         </w:rPr>
         <w:tab/>
-        <w:t xml:space="preserve">       AUG 2022 - AUG 2023</w:t>
+        <w:t xml:space="preserve">MAY 2025 – PRESENT</w:t>
       </w:r>
     </w:p>
     <w:p>
@@ -415,7 +613,7 @@
           <w:szCs w:val="21"/>
           <w:rtl w:val="0"/>
         </w:rPr>
-        <w:t xml:space="preserve">Built RAG (Retrieval-Augmented Generation) systems using LangChain and Pinecone vector database to process technical documentation, enabling intelligent question-answering with improved response accuracy and reduced manual lookup time for internal teams.</w:t>
+        <w:t xml:space="preserve">Develop full-stack applications with React, TypeScript, and Python (FastAPI), delivering production-grade features across the front end, back end, and REST APIs.</w:t>
       </w:r>
     </w:p>
     <w:p>
@@ -443,7 +641,7 @@
           <w:szCs w:val="21"/>
           <w:rtl w:val="0"/>
         </w:rPr>
-        <w:t xml:space="preserve">Developed and optimized prompts for GPT-3.5 and GPT-4 models, experimenting with different temperature settings and prompt structures to improve response quality and relevance, while managing API costs through token optimization strategies.</w:t>
+        <w:t xml:space="preserve">Build Generative AI features by integrating LLMs (GPT-4, Claude) into RAG pipelines with vector databases (Pinecone) and LangChain, enabling context-aware, document-grounded responses.</w:t>
       </w:r>
     </w:p>
     <w:p>
@@ -467,16 +665,460 @@
       <w:r>
         <w:rPr>
           <w:rFonts w:ascii="Arial" w:cs="Arial" w:eastAsia="Arial" w:hAnsi="Arial"/>
-          <w:sz w:val="22"/>
-          <w:szCs w:val="22"/>
-          <w:rtl w:val="0"/>
-        </w:rPr>
-        <w:t xml:space="preserve">Created API endpoints using FastAPI for LLM-powered applications, implemented document chunking and embedding workflows, and deployed Gen AI solutions on AWS Lambda with proper error handling and response validation.</w:t>
-      </w:r>
-      <w:r>
-        <w:rPr>
-          <w:rtl w:val="0"/>
-        </w:rPr>
+          <w:sz w:val="21"/>
+          <w:szCs w:val="21"/>
+          <w:rtl w:val="0"/>
+        </w:rPr>
+        <w:t xml:space="preserve">Design and optimize prompts and AI agent workflows, and deploy LLM-powered services to the cloud (AWS/GCP) with Docker, CI/CD, and automated testing.</w:t>
+      </w:r>
+    </w:p>
+    <w:p>
+      <w:pPr>
+        <w:tabs>
+          <w:tab w:val="left" w:leader="none" w:pos="900"/>
+          <w:tab w:val="right" w:leader="none" w:pos="10503"/>
+        </w:tabs>
+        <w:rPr>
+          <w:rFonts w:ascii="Arial" w:cs="Arial" w:eastAsia="Arial" w:hAnsi="Arial"/>
+          <w:sz w:val="21"/>
+          <w:szCs w:val="21"/>
+        </w:rPr>
+      </w:pPr>
+      <w:r>
+        <w:rPr>
+          <w:rFonts w:ascii="Arial" w:cs="Arial" w:eastAsia="Arial" w:hAnsi="Arial"/>
+          <w:sz w:val="21"/>
+          <w:szCs w:val="21"/>
+          <w:rtl w:val="0"/>
+        </w:rPr>
+        <w:br w:type="textWrapping"/>
+      </w:r>
+      <w:r>
+        <w:rPr>
+          <w:rFonts w:ascii="Arial" w:cs="Arial" w:eastAsia="Arial" w:hAnsi="Arial"/>
+          <w:b w:val="1"/>
+          <w:sz w:val="21"/>
+          <w:szCs w:val="21"/>
+          <w:rtl w:val="0"/>
+        </w:rPr>
+        <w:t xml:space="preserve">STACKBLOCKS LABS</w:t>
+      </w:r>
+      <w:r>
+        <w:rPr>
+          <w:rFonts w:ascii="Arial" w:cs="Arial" w:eastAsia="Arial" w:hAnsi="Arial"/>
+          <w:sz w:val="21"/>
+          <w:szCs w:val="21"/>
+          <w:rtl w:val="0"/>
+        </w:rPr>
+        <w:tab/>
+        <w:t xml:space="preserve">Hyderabad, IN</w:t>
+      </w:r>
+    </w:p>
+    <w:p>
+      <w:pPr>
+        <w:tabs>
+          <w:tab w:val="left" w:leader="none" w:pos="1134"/>
+          <w:tab w:val="right" w:leader="none" w:pos="10503"/>
+        </w:tabs>
+        <w:rPr>
+          <w:rFonts w:ascii="Arial" w:cs="Arial" w:eastAsia="Arial" w:hAnsi="Arial"/>
+          <w:sz w:val="21"/>
+          <w:szCs w:val="21"/>
+        </w:rPr>
+      </w:pPr>
+      <w:r>
+        <w:rPr>
+          <w:rFonts w:ascii="Arial" w:cs="Arial" w:eastAsia="Arial" w:hAnsi="Arial"/>
+          <w:b w:val="1"/>
+          <w:sz w:val="21"/>
+          <w:szCs w:val="21"/>
+          <w:rtl w:val="0"/>
+        </w:rPr>
+        <w:t xml:space="preserve">MLOps Engineer</w:t>
+      </w:r>
+      <w:r>
+        <w:rPr>
+          <w:rFonts w:ascii="Arial" w:cs="Arial" w:eastAsia="Arial" w:hAnsi="Arial"/>
+          <w:sz w:val="21"/>
+          <w:szCs w:val="21"/>
+          <w:rtl w:val="0"/>
+        </w:rPr>
+        <w:tab/>
+        <w:t xml:space="preserve">2022 – 2023</w:t>
+      </w:r>
+    </w:p>
+    <w:p>
+      <w:pPr>
+        <w:numPr>
+          <w:ilvl w:val="0"/>
+          <w:numId w:val="1"/>
+        </w:numPr>
+        <w:tabs>
+          <w:tab w:val="left" w:leader="none" w:pos="284"/>
+          <w:tab w:val="left" w:leader="none" w:pos="630"/>
+          <w:tab w:val="left" w:leader="none" w:pos="900"/>
+        </w:tabs>
+        <w:ind w:left="284" w:hanging="270"/>
+        <w:rPr>
+          <w:rFonts w:ascii="Noto Sans Symbols" w:cs="Noto Sans Symbols" w:eastAsia="Noto Sans Symbols" w:hAnsi="Noto Sans Symbols"/>
+          <w:sz w:val="21"/>
+          <w:szCs w:val="21"/>
+        </w:rPr>
+      </w:pPr>
+      <w:r>
+        <w:rPr>
+          <w:rFonts w:ascii="Arial" w:cs="Arial" w:eastAsia="Arial" w:hAnsi="Arial"/>
+          <w:sz w:val="21"/>
+          <w:szCs w:val="21"/>
+          <w:rtl w:val="0"/>
+        </w:rPr>
+        <w:t xml:space="preserve">Built and automated end-to-end ML pipelines for training, versioning, and deployment using MLflow, Docker, and Kubernetes, improving model release reliability.</w:t>
+      </w:r>
+    </w:p>
+    <w:p>
+      <w:pPr>
+        <w:numPr>
+          <w:ilvl w:val="0"/>
+          <w:numId w:val="1"/>
+        </w:numPr>
+        <w:tabs>
+          <w:tab w:val="left" w:leader="none" w:pos="284"/>
+          <w:tab w:val="left" w:leader="none" w:pos="630"/>
+          <w:tab w:val="left" w:leader="none" w:pos="900"/>
+        </w:tabs>
+        <w:ind w:left="284" w:hanging="270"/>
+        <w:rPr>
+          <w:rFonts w:ascii="Noto Sans Symbols" w:cs="Noto Sans Symbols" w:eastAsia="Noto Sans Symbols" w:hAnsi="Noto Sans Symbols"/>
+          <w:sz w:val="21"/>
+          <w:szCs w:val="21"/>
+        </w:rPr>
+      </w:pPr>
+      <w:r>
+        <w:rPr>
+          <w:rFonts w:ascii="Arial" w:cs="Arial" w:eastAsia="Arial" w:hAnsi="Arial"/>
+          <w:sz w:val="21"/>
+          <w:szCs w:val="21"/>
+          <w:rtl w:val="0"/>
+        </w:rPr>
+        <w:t xml:space="preserve">Orchestrated data and training workflows with Apache Airflow, enforced reproducibility with DVC and model registries, and monitored production models for drift and performance using Prometheus and Grafana.</w:t>
+      </w:r>
+    </w:p>
+    <w:p>
+      <w:pPr>
+        <w:numPr>
+          <w:ilvl w:val="0"/>
+          <w:numId w:val="1"/>
+        </w:numPr>
+        <w:tabs>
+          <w:tab w:val="left" w:leader="none" w:pos="284"/>
+          <w:tab w:val="left" w:leader="none" w:pos="630"/>
+          <w:tab w:val="left" w:leader="none" w:pos="900"/>
+        </w:tabs>
+        <w:ind w:left="284" w:hanging="270"/>
+        <w:rPr>
+          <w:rFonts w:ascii="Noto Sans Symbols" w:cs="Noto Sans Symbols" w:eastAsia="Noto Sans Symbols" w:hAnsi="Noto Sans Symbols"/>
+          <w:sz w:val="21"/>
+          <w:szCs w:val="21"/>
+        </w:rPr>
+      </w:pPr>
+      <w:r>
+        <w:rPr>
+          <w:rFonts w:ascii="Arial" w:cs="Arial" w:eastAsia="Arial" w:hAnsi="Arial"/>
+          <w:sz w:val="21"/>
+          <w:szCs w:val="21"/>
+          <w:rtl w:val="0"/>
+        </w:rPr>
+        <w:t xml:space="preserve">Operationalized early large language model workloads, serving and evaluating GPT-3.5 and open-source models for internal Gen AI prototypes and tooling.</w:t>
+      </w:r>
+    </w:p>
+    <w:p>
+      <w:pPr>
+        <w:tabs>
+          <w:tab w:val="left" w:leader="none" w:pos="900"/>
+          <w:tab w:val="right" w:leader="none" w:pos="10503"/>
+        </w:tabs>
+        <w:rPr>
+          <w:rFonts w:ascii="Arial" w:cs="Arial" w:eastAsia="Arial" w:hAnsi="Arial"/>
+          <w:sz w:val="21"/>
+          <w:szCs w:val="21"/>
+        </w:rPr>
+      </w:pPr>
+      <w:r>
+        <w:rPr>
+          <w:rFonts w:ascii="Arial" w:cs="Arial" w:eastAsia="Arial" w:hAnsi="Arial"/>
+          <w:sz w:val="21"/>
+          <w:szCs w:val="21"/>
+          <w:rtl w:val="0"/>
+        </w:rPr>
+        <w:br w:type="textWrapping"/>
+      </w:r>
+      <w:r>
+        <w:rPr>
+          <w:rFonts w:ascii="Arial" w:cs="Arial" w:eastAsia="Arial" w:hAnsi="Arial"/>
+          <w:b w:val="1"/>
+          <w:sz w:val="21"/>
+          <w:szCs w:val="21"/>
+          <w:rtl w:val="0"/>
+        </w:rPr>
+        <w:t xml:space="preserve">HONNEX SOFTWARE SOLUTIONS</w:t>
+      </w:r>
+      <w:r>
+        <w:rPr>
+          <w:rFonts w:ascii="Arial" w:cs="Arial" w:eastAsia="Arial" w:hAnsi="Arial"/>
+          <w:sz w:val="21"/>
+          <w:szCs w:val="21"/>
+          <w:rtl w:val="0"/>
+        </w:rPr>
+        <w:tab/>
+        <w:t xml:space="preserve">Hyderabad, IN</w:t>
+      </w:r>
+    </w:p>
+    <w:p>
+      <w:pPr>
+        <w:tabs>
+          <w:tab w:val="left" w:leader="none" w:pos="1134"/>
+          <w:tab w:val="right" w:leader="none" w:pos="10503"/>
+        </w:tabs>
+        <w:rPr>
+          <w:rFonts w:ascii="Arial" w:cs="Arial" w:eastAsia="Arial" w:hAnsi="Arial"/>
+          <w:sz w:val="21"/>
+          <w:szCs w:val="21"/>
+        </w:rPr>
+      </w:pPr>
+      <w:r>
+        <w:rPr>
+          <w:rFonts w:ascii="Arial" w:cs="Arial" w:eastAsia="Arial" w:hAnsi="Arial"/>
+          <w:b w:val="1"/>
+          <w:sz w:val="21"/>
+          <w:szCs w:val="21"/>
+          <w:rtl w:val="0"/>
+        </w:rPr>
+        <w:t xml:space="preserve">DevOps Engineer</w:t>
+      </w:r>
+      <w:r>
+        <w:rPr>
+          <w:rFonts w:ascii="Arial" w:cs="Arial" w:eastAsia="Arial" w:hAnsi="Arial"/>
+          <w:sz w:val="21"/>
+          <w:szCs w:val="21"/>
+          <w:rtl w:val="0"/>
+        </w:rPr>
+        <w:tab/>
+        <w:t xml:space="preserve">2020 – 2022</w:t>
+      </w:r>
+    </w:p>
+    <w:p>
+      <w:pPr>
+        <w:numPr>
+          <w:ilvl w:val="0"/>
+          <w:numId w:val="1"/>
+        </w:numPr>
+        <w:tabs>
+          <w:tab w:val="left" w:leader="none" w:pos="284"/>
+          <w:tab w:val="left" w:leader="none" w:pos="630"/>
+          <w:tab w:val="left" w:leader="none" w:pos="900"/>
+        </w:tabs>
+        <w:ind w:left="284" w:hanging="270"/>
+        <w:rPr>
+          <w:rFonts w:ascii="Noto Sans Symbols" w:cs="Noto Sans Symbols" w:eastAsia="Noto Sans Symbols" w:hAnsi="Noto Sans Symbols"/>
+          <w:sz w:val="21"/>
+          <w:szCs w:val="21"/>
+        </w:rPr>
+      </w:pPr>
+      <w:r>
+        <w:rPr>
+          <w:rFonts w:ascii="Arial" w:cs="Arial" w:eastAsia="Arial" w:hAnsi="Arial"/>
+          <w:sz w:val="21"/>
+          <w:szCs w:val="21"/>
+          <w:rtl w:val="0"/>
+        </w:rPr>
+        <w:t xml:space="preserve">Designed and maintained CI/CD pipelines using Jenkins and GitHub Actions to automate build, test, and deployment across environments.</w:t>
+      </w:r>
+    </w:p>
+    <w:p>
+      <w:pPr>
+        <w:numPr>
+          <w:ilvl w:val="0"/>
+          <w:numId w:val="1"/>
+        </w:numPr>
+        <w:tabs>
+          <w:tab w:val="left" w:leader="none" w:pos="284"/>
+          <w:tab w:val="left" w:leader="none" w:pos="630"/>
+          <w:tab w:val="left" w:leader="none" w:pos="900"/>
+        </w:tabs>
+        <w:ind w:left="284" w:hanging="270"/>
+        <w:rPr>
+          <w:rFonts w:ascii="Noto Sans Symbols" w:cs="Noto Sans Symbols" w:eastAsia="Noto Sans Symbols" w:hAnsi="Noto Sans Symbols"/>
+          <w:sz w:val="21"/>
+          <w:szCs w:val="21"/>
+        </w:rPr>
+      </w:pPr>
+      <w:r>
+        <w:rPr>
+          <w:rFonts w:ascii="Arial" w:cs="Arial" w:eastAsia="Arial" w:hAnsi="Arial"/>
+          <w:sz w:val="21"/>
+          <w:szCs w:val="21"/>
+          <w:rtl w:val="0"/>
+        </w:rPr>
+        <w:t xml:space="preserve">Containerized applications with Docker and orchestrated them on Kubernetes, and provisioned AWS infrastructure (EC2, S3, ECS) as code using Terraform and Ansible.</w:t>
+      </w:r>
+    </w:p>
+    <w:p>
+      <w:pPr>
+        <w:numPr>
+          <w:ilvl w:val="0"/>
+          <w:numId w:val="1"/>
+        </w:numPr>
+        <w:tabs>
+          <w:tab w:val="left" w:leader="none" w:pos="284"/>
+          <w:tab w:val="left" w:leader="none" w:pos="630"/>
+          <w:tab w:val="left" w:leader="none" w:pos="900"/>
+        </w:tabs>
+        <w:ind w:left="284" w:hanging="270"/>
+        <w:rPr>
+          <w:rFonts w:ascii="Noto Sans Symbols" w:cs="Noto Sans Symbols" w:eastAsia="Noto Sans Symbols" w:hAnsi="Noto Sans Symbols"/>
+          <w:sz w:val="21"/>
+          <w:szCs w:val="21"/>
+        </w:rPr>
+      </w:pPr>
+      <w:r>
+        <w:rPr>
+          <w:rFonts w:ascii="Arial" w:cs="Arial" w:eastAsia="Arial" w:hAnsi="Arial"/>
+          <w:sz w:val="21"/>
+          <w:szCs w:val="21"/>
+          <w:rtl w:val="0"/>
+        </w:rPr>
+        <w:t xml:space="preserve">Implemented monitoring, logging, and alerting with Prometheus, Grafana, and the ELK stack, reducing downtime and improving mean time to recovery.</w:t>
+      </w:r>
+    </w:p>
+    <w:p>
+      <w:pPr>
+        <w:tabs>
+          <w:tab w:val="left" w:leader="none" w:pos="900"/>
+          <w:tab w:val="right" w:leader="none" w:pos="10503"/>
+        </w:tabs>
+        <w:rPr>
+          <w:rFonts w:ascii="Arial" w:cs="Arial" w:eastAsia="Arial" w:hAnsi="Arial"/>
+          <w:sz w:val="21"/>
+          <w:szCs w:val="21"/>
+        </w:rPr>
+      </w:pPr>
+      <w:r>
+        <w:rPr>
+          <w:rFonts w:ascii="Arial" w:cs="Arial" w:eastAsia="Arial" w:hAnsi="Arial"/>
+          <w:sz w:val="21"/>
+          <w:szCs w:val="21"/>
+          <w:rtl w:val="0"/>
+        </w:rPr>
+        <w:br w:type="textWrapping"/>
+      </w:r>
+      <w:r>
+        <w:rPr>
+          <w:rFonts w:ascii="Arial" w:cs="Arial" w:eastAsia="Arial" w:hAnsi="Arial"/>
+          <w:b w:val="1"/>
+          <w:sz w:val="21"/>
+          <w:szCs w:val="21"/>
+          <w:rtl w:val="0"/>
+        </w:rPr>
+        <w:t xml:space="preserve">HONNEX SOFTWARE SOLUTIONS</w:t>
+      </w:r>
+      <w:r>
+        <w:rPr>
+          <w:rFonts w:ascii="Arial" w:cs="Arial" w:eastAsia="Arial" w:hAnsi="Arial"/>
+          <w:sz w:val="21"/>
+          <w:szCs w:val="21"/>
+          <w:rtl w:val="0"/>
+        </w:rPr>
+        <w:tab/>
+        <w:t xml:space="preserve">Hyderabad, IN</w:t>
+      </w:r>
+    </w:p>
+    <w:p>
+      <w:pPr>
+        <w:tabs>
+          <w:tab w:val="left" w:leader="none" w:pos="1134"/>
+          <w:tab w:val="right" w:leader="none" w:pos="10503"/>
+        </w:tabs>
+        <w:rPr>
+          <w:rFonts w:ascii="Arial" w:cs="Arial" w:eastAsia="Arial" w:hAnsi="Arial"/>
+          <w:sz w:val="21"/>
+          <w:szCs w:val="21"/>
+        </w:rPr>
+      </w:pPr>
+      <w:r>
+        <w:rPr>
+          <w:rFonts w:ascii="Arial" w:cs="Arial" w:eastAsia="Arial" w:hAnsi="Arial"/>
+          <w:b w:val="1"/>
+          <w:sz w:val="21"/>
+          <w:szCs w:val="21"/>
+          <w:rtl w:val="0"/>
+        </w:rPr>
+        <w:t xml:space="preserve">Web Developer (Intern)</w:t>
+      </w:r>
+      <w:r>
+        <w:rPr>
+          <w:rFonts w:ascii="Arial" w:cs="Arial" w:eastAsia="Arial" w:hAnsi="Arial"/>
+          <w:sz w:val="21"/>
+          <w:szCs w:val="21"/>
+          <w:rtl w:val="0"/>
+        </w:rPr>
+        <w:tab/>
+        <w:t xml:space="preserve">2019 – 2020</w:t>
+      </w:r>
+    </w:p>
+    <w:p>
+      <w:pPr>
+        <w:numPr>
+          <w:ilvl w:val="0"/>
+          <w:numId w:val="1"/>
+        </w:numPr>
+        <w:tabs>
+          <w:tab w:val="left" w:leader="none" w:pos="284"/>
+          <w:tab w:val="left" w:leader="none" w:pos="630"/>
+          <w:tab w:val="left" w:leader="none" w:pos="900"/>
+        </w:tabs>
+        <w:ind w:left="284" w:hanging="270"/>
+        <w:rPr>
+          <w:rFonts w:ascii="Noto Sans Symbols" w:cs="Noto Sans Symbols" w:eastAsia="Noto Sans Symbols" w:hAnsi="Noto Sans Symbols"/>
+          <w:sz w:val="21"/>
+          <w:szCs w:val="21"/>
+        </w:rPr>
+      </w:pPr>
+      <w:r>
+        <w:rPr>
+          <w:rFonts w:ascii="Arial" w:cs="Arial" w:eastAsia="Arial" w:hAnsi="Arial"/>
+          <w:sz w:val="21"/>
+          <w:szCs w:val="21"/>
+          <w:rtl w:val="0"/>
+        </w:rPr>
+        <w:t xml:space="preserve">Built responsive, cross-browser web interfaces using HTML5, CSS3, JavaScript (ES6), Bootstrap, and jQuery.</w:t>
+      </w:r>
+    </w:p>
+    <w:p>
+      <w:pPr>
+        <w:numPr>
+          <w:ilvl w:val="0"/>
+          <w:numId w:val="1"/>
+        </w:numPr>
+        <w:tabs>
+          <w:tab w:val="left" w:leader="none" w:pos="284"/>
+          <w:tab w:val="left" w:leader="none" w:pos="630"/>
+          <w:tab w:val="left" w:leader="none" w:pos="900"/>
+        </w:tabs>
+        <w:ind w:left="284" w:hanging="270"/>
+        <w:rPr>
+          <w:rFonts w:ascii="Noto Sans Symbols" w:cs="Noto Sans Symbols" w:eastAsia="Noto Sans Symbols" w:hAnsi="Noto Sans Symbols"/>
+          <w:sz w:val="21"/>
+          <w:szCs w:val="21"/>
+        </w:rPr>
+      </w:pPr>
+      <w:r>
+        <w:rPr>
+          <w:rFonts w:ascii="Arial" w:cs="Arial" w:eastAsia="Arial" w:hAnsi="Arial"/>
+          <w:sz w:val="21"/>
+          <w:szCs w:val="21"/>
+          <w:rtl w:val="0"/>
+        </w:rPr>
+        <w:t xml:space="preserve">Developed interactive front-end components with React and consumed REST APIs via AJAX, and supported Node.js/Express and MySQL back-end features using Git in an Agile team.</w:t>
       </w:r>
     </w:p>
     <w:p>
@@ -511,10 +1153,8 @@
         </w:tabs>
         <w:rPr>
           <w:rFonts w:ascii="Arial" w:cs="Arial" w:eastAsia="Arial" w:hAnsi="Arial"/>
-          <w:color w:val="434343"/>
-          <w:sz w:val="21"/>
-          <w:szCs w:val="21"/>
-          <w:vertAlign w:val="baseline"/>
+          <w:sz w:val="21"/>
+          <w:szCs w:val="21"/>
         </w:rPr>
       </w:pPr>
       <w:r>
@@ -525,15 +1165,13 @@
           <w:szCs w:val="22"/>
           <w:rtl w:val="0"/>
         </w:rPr>
-        <w:t xml:space="preserve">EDUCATION</w:t>
-      </w:r>
-      <w:r>
-        <w:rPr>
-          <w:rFonts w:ascii="Arial" w:cs="Arial" w:eastAsia="Arial" w:hAnsi="Arial"/>
-          <w:color w:val="434343"/>
-          <w:sz w:val="21"/>
-          <w:szCs w:val="21"/>
-          <w:vertAlign w:val="baseline"/>
+        <w:t xml:space="preserve">PROJECTS</w:t>
+      </w:r>
+      <w:r>
+        <w:rPr>
+          <w:rFonts w:ascii="Arial" w:cs="Arial" w:eastAsia="Arial" w:hAnsi="Arial"/>
+          <w:sz w:val="21"/>
+          <w:szCs w:val="21"/>
           <w:rtl w:val="0"/>
         </w:rPr>
         <w:tab/>
@@ -542,228 +1180,129 @@
     <w:p>
       <w:pPr>
         <w:tabs>
-          <w:tab w:val="left" w:leader="none" w:pos="900"/>
-        </w:tabs>
-        <w:rPr>
-          <w:rFonts w:ascii="Arial" w:cs="Arial" w:eastAsia="Arial" w:hAnsi="Arial"/>
-          <w:b w:val="0"/>
-          <w:sz w:val="4"/>
-          <w:szCs w:val="4"/>
-          <w:vertAlign w:val="baseline"/>
-        </w:rPr>
-      </w:pPr>
-      <w:r>
-        <w:rPr>
-          <w:rtl w:val="0"/>
-        </w:rPr>
-      </w:r>
-    </w:p>
-    <w:p>
-      <w:pPr>
-        <w:tabs>
-          <w:tab w:val="left" w:leader="none" w:pos="900"/>
-        </w:tabs>
-        <w:rPr>
-          <w:rFonts w:ascii="Arial" w:cs="Arial" w:eastAsia="Arial" w:hAnsi="Arial"/>
-          <w:b w:val="0"/>
-          <w:sz w:val="6"/>
-          <w:szCs w:val="6"/>
-          <w:vertAlign w:val="baseline"/>
-        </w:rPr>
-      </w:pPr>
-      <w:r>
-        <w:rPr>
-          <w:rtl w:val="0"/>
-        </w:rPr>
-      </w:r>
-    </w:p>
-    <w:p>
-      <w:pPr>
-        <w:tabs>
-          <w:tab w:val="left" w:leader="none" w:pos="900"/>
-        </w:tabs>
-        <w:rPr>
-          <w:rFonts w:ascii="Arial" w:cs="Arial" w:eastAsia="Arial" w:hAnsi="Arial"/>
-          <w:sz w:val="6"/>
-          <w:szCs w:val="6"/>
-        </w:rPr>
-      </w:pPr>
-      <w:r>
-        <w:rPr>
-          <w:rtl w:val="0"/>
-        </w:rPr>
-      </w:r>
-    </w:p>
-    <w:p>
-      <w:pPr>
-        <w:pBdr>
-          <w:bottom w:color="000000" w:space="1" w:sz="6" w:val="single"/>
-        </w:pBdr>
-        <w:tabs>
-          <w:tab w:val="left" w:leader="none" w:pos="900"/>
-        </w:tabs>
-        <w:rPr>
-          <w:rFonts w:ascii="Arial" w:cs="Arial" w:eastAsia="Arial" w:hAnsi="Arial"/>
-          <w:sz w:val="21"/>
-          <w:szCs w:val="21"/>
-        </w:rPr>
-      </w:pPr>
-      <w:r>
-        <w:rPr>
-          <w:rFonts w:ascii="Arial" w:cs="Arial" w:eastAsia="Arial" w:hAnsi="Arial"/>
-          <w:b w:val="1"/>
-          <w:sz w:val="21"/>
-          <w:szCs w:val="21"/>
-          <w:rtl w:val="0"/>
-        </w:rPr>
-        <w:t xml:space="preserve">CLEVELAND STATE  UNIVERSITY</w:t>
-      </w:r>
-      <w:r>
-        <w:rPr>
-          <w:rFonts w:ascii="Arial" w:cs="Arial" w:eastAsia="Arial" w:hAnsi="Arial"/>
-          <w:sz w:val="21"/>
-          <w:szCs w:val="21"/>
-          <w:rtl w:val="0"/>
-        </w:rPr>
-        <w:tab/>
-        <w:t xml:space="preserve">                                                                                         Cleveland, OH</w:t>
-      </w:r>
-    </w:p>
-    <w:p>
-      <w:pPr>
-        <w:pBdr>
-          <w:bottom w:color="000000" w:space="1" w:sz="6" w:val="single"/>
-        </w:pBdr>
-        <w:tabs>
-          <w:tab w:val="left" w:leader="none" w:pos="900"/>
-        </w:tabs>
-        <w:rPr>
-          <w:rFonts w:ascii="Arial" w:cs="Arial" w:eastAsia="Arial" w:hAnsi="Arial"/>
-          <w:sz w:val="21"/>
-          <w:szCs w:val="21"/>
-        </w:rPr>
-      </w:pPr>
-      <w:r>
-        <w:rPr>
-          <w:rFonts w:ascii="Arial" w:cs="Arial" w:eastAsia="Arial" w:hAnsi="Arial"/>
-          <w:sz w:val="21"/>
-          <w:szCs w:val="21"/>
-          <w:rtl w:val="0"/>
-        </w:rPr>
-        <w:t xml:space="preserve">Masters in Computer Software Engineering</w:t>
-        <w:tab/>
-        <w:t xml:space="preserve">                                                                               MAY 2025</w:t>
-      </w:r>
-    </w:p>
-    <w:p>
-      <w:pPr>
-        <w:pBdr>
-          <w:bottom w:color="000000" w:space="1" w:sz="6" w:val="single"/>
-        </w:pBdr>
-        <w:tabs>
-          <w:tab w:val="left" w:leader="none" w:pos="900"/>
-        </w:tabs>
-        <w:rPr>
-          <w:rFonts w:ascii="Arial" w:cs="Arial" w:eastAsia="Arial" w:hAnsi="Arial"/>
-          <w:sz w:val="21"/>
-          <w:szCs w:val="21"/>
-        </w:rPr>
-      </w:pPr>
-      <w:r>
-        <w:rPr>
-          <w:rFonts w:ascii="Arial" w:cs="Arial" w:eastAsia="Arial" w:hAnsi="Arial"/>
-          <w:sz w:val="21"/>
-          <w:szCs w:val="21"/>
-          <w:rtl w:val="0"/>
-        </w:rPr>
-        <w:t xml:space="preserve">Cumulative GPA: 3.7/4.0</w:t>
-      </w:r>
-    </w:p>
-    <w:p>
-      <w:pPr>
-        <w:pBdr>
-          <w:bottom w:color="000000" w:space="1" w:sz="6" w:val="single"/>
-        </w:pBdr>
-        <w:tabs>
-          <w:tab w:val="left" w:leader="none" w:pos="900"/>
-        </w:tabs>
-        <w:rPr>
-          <w:rFonts w:ascii="Arial" w:cs="Arial" w:eastAsia="Arial" w:hAnsi="Arial"/>
-          <w:b w:val="1"/>
-          <w:sz w:val="21"/>
-          <w:szCs w:val="21"/>
-        </w:rPr>
-      </w:pPr>
-      <w:r>
-        <w:rPr>
-          <w:rFonts w:ascii="Arial" w:cs="Arial" w:eastAsia="Arial" w:hAnsi="Arial"/>
-          <w:sz w:val="21"/>
-          <w:szCs w:val="21"/>
-          <w:rtl w:val="0"/>
-        </w:rPr>
-        <w:t xml:space="preserve">Relevant Coursework: Software Engineering, Operating Systems, Computer Networks II, Database Systems</w:t>
-      </w:r>
-      <w:r>
-        <w:rPr>
-          <w:rtl w:val="0"/>
-        </w:rPr>
-      </w:r>
-    </w:p>
-    <w:p>
-      <w:pPr>
-        <w:pBdr>
-          <w:bottom w:color="000000" w:space="1" w:sz="6" w:val="single"/>
-        </w:pBdr>
-        <w:tabs>
-          <w:tab w:val="left" w:leader="none" w:pos="900"/>
-        </w:tabs>
-        <w:rPr>
-          <w:rFonts w:ascii="Arial" w:cs="Arial" w:eastAsia="Arial" w:hAnsi="Arial"/>
-          <w:b w:val="0"/>
-          <w:color w:val="ff0000"/>
-          <w:sz w:val="21"/>
-          <w:szCs w:val="21"/>
-          <w:vertAlign w:val="baseline"/>
-        </w:rPr>
-      </w:pPr>
-      <w:r>
-        <w:rPr>
-          <w:rtl w:val="0"/>
-        </w:rPr>
-      </w:r>
-    </w:p>
-    <w:p>
-      <w:pPr>
-        <w:pBdr>
-          <w:bottom w:color="000000" w:space="1" w:sz="6" w:val="single"/>
-        </w:pBdr>
-        <w:tabs>
-          <w:tab w:val="left" w:leader="none" w:pos="900"/>
-        </w:tabs>
-        <w:rPr>
-          <w:rFonts w:ascii="Arial" w:cs="Arial" w:eastAsia="Arial" w:hAnsi="Arial"/>
-          <w:sz w:val="21"/>
-          <w:szCs w:val="21"/>
-        </w:rPr>
-      </w:pPr>
-      <w:r>
-        <w:rPr>
-          <w:rFonts w:ascii="Arial" w:cs="Arial" w:eastAsia="Arial" w:hAnsi="Arial"/>
-          <w:b w:val="1"/>
+          <w:tab w:val="left" w:leader="none" w:pos="1134"/>
+          <w:tab w:val="right" w:leader="none" w:pos="10503"/>
+        </w:tabs>
+        <w:spacing w:after="240" w:before="240" w:lineRule="auto"/>
+        <w:rPr>
           <w:sz w:val="22"/>
           <w:szCs w:val="22"/>
-          <w:rtl w:val="0"/>
-        </w:rPr>
-        <w:t xml:space="preserve">PROJECTS</w:t>
-      </w:r>
-      <w:r>
-        <w:rPr>
-          <w:rFonts w:ascii="Arial" w:cs="Arial" w:eastAsia="Arial" w:hAnsi="Arial"/>
-          <w:sz w:val="21"/>
-          <w:szCs w:val="21"/>
-          <w:rtl w:val="0"/>
-        </w:rPr>
-        <w:tab/>
+        </w:rPr>
+      </w:pPr>
+      <w:r>
+        <w:rPr>
+          <w:rFonts w:ascii="Arial" w:cs="Arial" w:eastAsia="Arial" w:hAnsi="Arial"/>
+          <w:b w:val="1"/>
+          <w:sz w:val="21"/>
+          <w:szCs w:val="21"/>
+          <w:rtl w:val="0"/>
+        </w:rPr>
+        <w:t xml:space="preserve">RustRun (</w:t>
+      </w:r>
+      <w:hyperlink r:id="rId13">
+        <w:r>
+          <w:rPr>
+            <w:rFonts w:ascii="Arial" w:cs="Arial" w:eastAsia="Arial" w:hAnsi="Arial"/>
+            <w:b w:val="1"/>
+            <w:color w:val="1155cc"/>
+            <w:sz w:val="21"/>
+            <w:szCs w:val="21"/>
+            <w:u w:val="single"/>
+            <w:rtl w:val="0"/>
+          </w:rPr>
+          <w:t xml:space="preserve">Link</w:t>
+        </w:r>
+      </w:hyperlink>
+      <w:r>
+        <w:rPr>
+          <w:rFonts w:ascii="Arial" w:cs="Arial" w:eastAsia="Arial" w:hAnsi="Arial"/>
+          <w:b w:val="1"/>
+          <w:sz w:val="21"/>
+          <w:szCs w:val="21"/>
+          <w:rtl w:val="0"/>
+        </w:rPr>
+        <w:t xml:space="preserve">)</w:t>
+      </w:r>
+      <w:r>
+        <w:rPr>
+          <w:rtl w:val="0"/>
+        </w:rPr>
+      </w:r>
+    </w:p>
+    <w:p>
+      <w:pPr>
+        <w:numPr>
+          <w:ilvl w:val="0"/>
+          <w:numId w:val="2"/>
+        </w:numPr>
+        <w:tabs>
+          <w:tab w:val="left" w:leader="none" w:pos="284"/>
+          <w:tab w:val="left" w:leader="none" w:pos="630"/>
+          <w:tab w:val="left" w:leader="none" w:pos="900"/>
+        </w:tabs>
+        <w:ind w:left="284" w:hanging="270"/>
+        <w:rPr>
+          <w:rFonts w:ascii="Noto Sans Symbols" w:cs="Noto Sans Symbols" w:eastAsia="Noto Sans Symbols" w:hAnsi="Noto Sans Symbols"/>
+          <w:sz w:val="21"/>
+          <w:szCs w:val="21"/>
+        </w:rPr>
+      </w:pPr>
+      <w:r>
+        <w:rPr>
+          <w:rFonts w:ascii="Arial" w:cs="Arial" w:eastAsia="Arial" w:hAnsi="Arial"/>
+          <w:b w:val="1"/>
+          <w:sz w:val="21"/>
+          <w:szCs w:val="21"/>
+          <w:rtl w:val="0"/>
+        </w:rPr>
+        <w:t xml:space="preserve">Browser-Based Solana IDE</w:t>
+      </w:r>
+      <w:r>
+        <w:rPr>
+          <w:rFonts w:ascii="Arial" w:cs="Arial" w:eastAsia="Arial" w:hAnsi="Arial"/>
+          <w:sz w:val="21"/>
+          <w:szCs w:val="21"/>
+          <w:rtl w:val="0"/>
+        </w:rPr>
+        <w:t xml:space="preserve">: Write, build, and deploy Solana Anchor (Rust) programs to devnet from a Monaco code editor in the browser — no local toolchain setup required.</w:t>
+      </w:r>
+    </w:p>
+    <w:p>
+      <w:pPr>
+        <w:numPr>
+          <w:ilvl w:val="0"/>
+          <w:numId w:val="2"/>
+        </w:numPr>
+        <w:tabs>
+          <w:tab w:val="left" w:leader="none" w:pos="284"/>
+          <w:tab w:val="left" w:leader="none" w:pos="630"/>
+          <w:tab w:val="left" w:leader="none" w:pos="900"/>
+        </w:tabs>
+        <w:ind w:left="284" w:hanging="270"/>
+        <w:rPr>
+          <w:rFonts w:ascii="Noto Sans Symbols" w:cs="Noto Sans Symbols" w:eastAsia="Noto Sans Symbols" w:hAnsi="Noto Sans Symbols"/>
+          <w:sz w:val="21"/>
+          <w:szCs w:val="21"/>
+        </w:rPr>
+      </w:pPr>
+      <w:r>
+        <w:rPr>
+          <w:rFonts w:ascii="Arial" w:cs="Arial" w:eastAsia="Arial" w:hAnsi="Arial"/>
+          <w:b w:val="1"/>
+          <w:sz w:val="21"/>
+          <w:szCs w:val="21"/>
+          <w:rtl w:val="0"/>
+        </w:rPr>
+        <w:t xml:space="preserve">Claude-Powered AI Assistant</w:t>
+      </w:r>
+      <w:r>
+        <w:rPr>
+          <w:rFonts w:ascii="Arial" w:cs="Arial" w:eastAsia="Arial" w:hAnsi="Arial"/>
+          <w:sz w:val="21"/>
+          <w:szCs w:val="21"/>
+          <w:rtl w:val="0"/>
+        </w:rPr>
+        <w:t xml:space="preserve">: Scaffold complete Anchor programs with contextual, AI-assisted code generation via the Claude API, built on a React front end with a Supabase backend.</w:t>
       </w:r>
     </w:p>
     <w:p>
@@ -1314,216 +1853,349 @@
         </w:tabs>
         <w:rPr>
           <w:rFonts w:ascii="Arial" w:cs="Arial" w:eastAsia="Arial" w:hAnsi="Arial"/>
-          <w:sz w:val="21"/>
-          <w:szCs w:val="21"/>
-        </w:rPr>
-      </w:pPr>
-      <w:r>
-        <w:rPr>
-          <w:rFonts w:ascii="Arial" w:cs="Arial" w:eastAsia="Arial" w:hAnsi="Arial"/>
-          <w:b w:val="1"/>
-          <w:color w:val="404040"/>
+          <w:color w:val="434343"/>
+          <w:sz w:val="21"/>
+          <w:szCs w:val="21"/>
+          <w:vertAlign w:val="baseline"/>
+        </w:rPr>
+      </w:pPr>
+      <w:r>
+        <w:rPr>
+          <w:rFonts w:ascii="Arial" w:cs="Arial" w:eastAsia="Arial" w:hAnsi="Arial"/>
+          <w:b w:val="1"/>
           <w:sz w:val="22"/>
           <w:szCs w:val="22"/>
           <w:rtl w:val="0"/>
         </w:rPr>
-        <w:t xml:space="preserve">TECHNICAL SKILLS</w:t>
-      </w:r>
-      <w:r>
-        <w:rPr>
-          <w:rtl w:val="0"/>
-        </w:rPr>
-      </w:r>
-    </w:p>
-    <w:p>
-      <w:pPr>
-        <w:keepNext w:val="1"/>
-        <w:widowControl w:val="0"/>
-        <w:tabs>
-          <w:tab w:val="left" w:leader="none" w:pos="630"/>
-          <w:tab w:val="left" w:leader="none" w:pos="900"/>
-        </w:tabs>
-        <w:spacing w:after="240" w:before="240" w:lineRule="auto"/>
-        <w:rPr>
-          <w:rFonts w:ascii="Arial" w:cs="Arial" w:eastAsia="Arial" w:hAnsi="Arial"/>
-          <w:b w:val="1"/>
-          <w:sz w:val="21"/>
-          <w:szCs w:val="21"/>
-        </w:rPr>
-      </w:pPr>
-      <w:r>
-        <w:rPr>
-          <w:rFonts w:ascii="Arial" w:cs="Arial" w:eastAsia="Arial" w:hAnsi="Arial"/>
-          <w:b w:val="1"/>
-          <w:sz w:val="21"/>
-          <w:szCs w:val="21"/>
-          <w:rtl w:val="0"/>
-        </w:rPr>
-        <w:t xml:space="preserve">Generative AI &amp;amp; LLM Engineering:</w:t>
-      </w:r>
-      <w:r>
-        <w:rPr>
-          <w:rFonts w:ascii="Arial" w:cs="Arial" w:eastAsia="Arial" w:hAnsi="Arial"/>
-          <w:sz w:val="21"/>
-          <w:szCs w:val="21"/>
-          <w:rtl w:val="0"/>
-        </w:rPr>
-        <w:t xml:space="preserve"> Large Language Models (GPT-4, GPT-3.5, Claude), OpenAI API, RAG (Retrieval-Augmented Generation), Prompt Engineering, Vector Databases (Pinecone, Chroma, FAISS), LangChain, Hugging Face, Embedding Models (OpenAI Embeddings, Sentence-Transformers), Semantic Search, Document Processing</w:t>
-      </w:r>
-      <w:r>
-        <w:rPr>
-          <w:rtl w:val="0"/>
-        </w:rPr>
-      </w:r>
-    </w:p>
-    <w:p>
-      <w:pPr>
-        <w:keepNext w:val="1"/>
-        <w:widowControl w:val="0"/>
-        <w:tabs>
-          <w:tab w:val="left" w:leader="none" w:pos="630"/>
-          <w:tab w:val="left" w:leader="none" w:pos="900"/>
-        </w:tabs>
-        <w:spacing w:after="240" w:before="240" w:lineRule="auto"/>
-        <w:rPr>
-          <w:rFonts w:ascii="Arial" w:cs="Arial" w:eastAsia="Arial" w:hAnsi="Arial"/>
-          <w:sz w:val="21"/>
-          <w:szCs w:val="21"/>
-        </w:rPr>
-      </w:pPr>
-      <w:r>
-        <w:rPr>
-          <w:rFonts w:ascii="Arial" w:cs="Arial" w:eastAsia="Arial" w:hAnsi="Arial"/>
-          <w:b w:val="1"/>
-          <w:sz w:val="21"/>
-          <w:szCs w:val="21"/>
-          <w:rtl w:val="0"/>
-        </w:rPr>
-        <w:t xml:space="preserve">Development Tools &amp;amp; Frameworks:</w:t>
-      </w:r>
-      <w:r>
-        <w:rPr>
-          <w:rFonts w:ascii="Arial" w:cs="Arial" w:eastAsia="Arial" w:hAnsi="Arial"/>
-          <w:sz w:val="21"/>
-          <w:szCs w:val="21"/>
-          <w:rtl w:val="0"/>
-        </w:rPr>
-        <w:t xml:space="preserve"> Python (FastAPI, Streamlit, LangChain, Pandas, NumPy), SQL, Jupyter Notebooks, Git, GitHub, REST APIs, AWS (Lambda, S3), Google Cloud Platform (Vertex AI), Docker, Postman, VS Code</w:t>
-      </w:r>
-    </w:p>
-    <w:p>
-      <w:pPr>
-        <w:keepNext w:val="1"/>
-        <w:widowControl w:val="0"/>
-        <w:tabs>
-          <w:tab w:val="left" w:leader="none" w:pos="630"/>
-          <w:tab w:val="left" w:leader="none" w:pos="900"/>
-        </w:tabs>
-        <w:spacing w:after="240" w:before="240" w:lineRule="auto"/>
-        <w:rPr>
-          <w:rFonts w:ascii="Arial" w:cs="Arial" w:eastAsia="Arial" w:hAnsi="Arial"/>
-          <w:sz w:val="21"/>
-          <w:szCs w:val="21"/>
-        </w:rPr>
-      </w:pPr>
-      <w:r>
-        <w:rPr>
-          <w:rFonts w:ascii="Arial" w:cs="Arial" w:eastAsia="Arial" w:hAnsi="Arial"/>
-          <w:b w:val="1"/>
-          <w:sz w:val="21"/>
-          <w:szCs w:val="21"/>
-          <w:rtl w:val="0"/>
-        </w:rPr>
-        <w:t xml:space="preserve">Technical Expertise:</w:t>
-      </w:r>
-      <w:r>
-        <w:rPr>
-          <w:rFonts w:ascii="Arial" w:cs="Arial" w:eastAsia="Arial" w:hAnsi="Arial"/>
-          <w:sz w:val="21"/>
-          <w:szCs w:val="21"/>
-          <w:rtl w:val="0"/>
-        </w:rPr>
-        <w:t xml:space="preserve"> LLM API Integration, Prompt Engineering &amp; Optimization, Basic RAG Implementation, Vector Database Setup, Document Chunking &amp; Embedding, API Development (FastAPI), Building Chatbots, Question-Answering Systems, Text Generation Applications, Cost Management, Response Quality Testing</w:t>
-      </w:r>
-    </w:p>
-    <w:p>
-      <w:pPr>
-        <w:keepNext w:val="1"/>
-        <w:widowControl w:val="0"/>
-        <w:tabs>
-          <w:tab w:val="left" w:leader="none" w:pos="630"/>
-          <w:tab w:val="left" w:leader="none" w:pos="900"/>
-        </w:tabs>
-        <w:spacing w:after="240" w:before="240" w:lineRule="auto"/>
-        <w:rPr>
-          <w:rFonts w:ascii="Arial" w:cs="Arial" w:eastAsia="Arial" w:hAnsi="Arial"/>
-          <w:b w:val="1"/>
-          <w:sz w:val="21"/>
-          <w:szCs w:val="21"/>
-        </w:rPr>
-      </w:pPr>
-      <w:r>
-        <w:rPr>
-          <w:rFonts w:ascii="Arial" w:cs="Arial" w:eastAsia="Arial" w:hAnsi="Arial"/>
-          <w:b w:val="1"/>
-          <w:sz w:val="21"/>
-          <w:szCs w:val="21"/>
-          <w:rtl w:val="0"/>
-        </w:rPr>
-        <w:t xml:space="preserve">Functional Expertise:</w:t>
-      </w:r>
-      <w:r>
-        <w:rPr>
-          <w:rFonts w:ascii="Arial" w:cs="Arial" w:eastAsia="Arial" w:hAnsi="Arial"/>
-          <w:sz w:val="21"/>
-          <w:szCs w:val="21"/>
-          <w:rtl w:val="0"/>
-        </w:rPr>
-        <w:t xml:space="preserve"> Building Gen AI Applications, Prompt Template Design, API Integration &amp; Testing, Document Processing Pipelines, Basic RAG System Development, Working with Vector Databases, Token Usage Optimization, Debugging LLM Responses, Version Control with Git, Cloud Deployment (AWS/GCP), Collaborative Development</w:t>
-      </w:r>
-      <w:r>
-        <w:rPr>
-          <w:rFonts w:ascii="Arial" w:cs="Arial" w:eastAsia="Arial" w:hAnsi="Arial"/>
-          <w:b w:val="1"/>
-          <w:sz w:val="21"/>
-          <w:szCs w:val="21"/>
-          <w:rtl w:val="0"/>
-        </w:rPr>
-        <w:t xml:space="preserve">s</w:t>
-      </w:r>
-    </w:p>
-    <w:p>
-      <w:pPr>
-        <w:keepNext w:val="1"/>
-        <w:widowControl w:val="0"/>
-        <w:tabs>
-          <w:tab w:val="left" w:leader="none" w:pos="630"/>
-          <w:tab w:val="left" w:leader="none" w:pos="900"/>
-        </w:tabs>
-        <w:spacing w:after="240" w:before="240" w:lineRule="auto"/>
-        <w:rPr>
-          <w:rFonts w:ascii="Arial" w:cs="Arial" w:eastAsia="Arial" w:hAnsi="Arial"/>
-          <w:b w:val="1"/>
-          <w:sz w:val="21"/>
-          <w:szCs w:val="21"/>
-        </w:rPr>
-      </w:pPr>
-      <w:r>
-        <w:rPr>
-          <w:rtl w:val="0"/>
-        </w:rPr>
-      </w:r>
-    </w:p>
-    <w:p>
-      <w:pPr>
-        <w:tabs>
-          <w:tab w:val="left" w:leader="none" w:pos="630"/>
-          <w:tab w:val="left" w:leader="none" w:pos="900"/>
-        </w:tabs>
-        <w:rPr>
-          <w:rFonts w:ascii="Arial" w:cs="Arial" w:eastAsia="Arial" w:hAnsi="Arial"/>
-          <w:sz w:val="21"/>
-          <w:szCs w:val="21"/>
+        <w:t xml:space="preserve">EDUCATION</w:t>
+      </w:r>
+      <w:r>
+        <w:rPr>
+          <w:rFonts w:ascii="Arial" w:cs="Arial" w:eastAsia="Arial" w:hAnsi="Arial"/>
+          <w:color w:val="434343"/>
+          <w:sz w:val="21"/>
+          <w:szCs w:val="21"/>
+          <w:vertAlign w:val="baseline"/>
+          <w:rtl w:val="0"/>
+        </w:rPr>
+        <w:tab/>
+      </w:r>
+    </w:p>
+    <w:p>
+      <w:pPr>
+        <w:tabs>
+          <w:tab w:val="left" w:leader="none" w:pos="900"/>
+        </w:tabs>
+        <w:rPr>
+          <w:rFonts w:ascii="Arial" w:cs="Arial" w:eastAsia="Arial" w:hAnsi="Arial"/>
+          <w:b w:val="0"/>
+          <w:sz w:val="4"/>
+          <w:szCs w:val="4"/>
+          <w:vertAlign w:val="baseline"/>
+        </w:rPr>
+      </w:pPr>
+      <w:r>
+        <w:rPr>
+          <w:rtl w:val="0"/>
+        </w:rPr>
+      </w:r>
+    </w:p>
+    <w:p>
+      <w:pPr>
+        <w:tabs>
+          <w:tab w:val="left" w:leader="none" w:pos="900"/>
+        </w:tabs>
+        <w:rPr>
+          <w:rFonts w:ascii="Arial" w:cs="Arial" w:eastAsia="Arial" w:hAnsi="Arial"/>
+          <w:b w:val="0"/>
+          <w:sz w:val="6"/>
+          <w:szCs w:val="6"/>
+          <w:vertAlign w:val="baseline"/>
+        </w:rPr>
+      </w:pPr>
+      <w:r>
+        <w:rPr>
+          <w:rtl w:val="0"/>
+        </w:rPr>
+      </w:r>
+    </w:p>
+    <w:p>
+      <w:pPr>
+        <w:tabs>
+          <w:tab w:val="left" w:leader="none" w:pos="900"/>
+        </w:tabs>
+        <w:rPr>
+          <w:rFonts w:ascii="Arial" w:cs="Arial" w:eastAsia="Arial" w:hAnsi="Arial"/>
+          <w:sz w:val="6"/>
+          <w:szCs w:val="6"/>
+        </w:rPr>
+      </w:pPr>
+      <w:r>
+        <w:rPr>
+          <w:rtl w:val="0"/>
+        </w:rPr>
+      </w:r>
+    </w:p>
+    <w:p>
+      <w:pPr>
+        <w:pBdr>
+          <w:bottom w:color="000000" w:space="1" w:sz="6" w:val="single"/>
+        </w:pBdr>
+        <w:tabs>
+          <w:tab w:val="left" w:leader="none" w:pos="900"/>
+        </w:tabs>
+        <w:rPr>
+          <w:rFonts w:ascii="Arial" w:cs="Arial" w:eastAsia="Arial" w:hAnsi="Arial"/>
+          <w:sz w:val="21"/>
+          <w:szCs w:val="21"/>
+        </w:rPr>
+      </w:pPr>
+      <w:r>
+        <w:rPr>
+          <w:rFonts w:ascii="Arial" w:cs="Arial" w:eastAsia="Arial" w:hAnsi="Arial"/>
+          <w:b w:val="1"/>
+          <w:sz w:val="21"/>
+          <w:szCs w:val="21"/>
+          <w:rtl w:val="0"/>
+        </w:rPr>
+        <w:t xml:space="preserve">CLEVELAND STATE  UNIVERSITY</w:t>
+      </w:r>
+      <w:r>
+        <w:rPr>
+          <w:rFonts w:ascii="Arial" w:cs="Arial" w:eastAsia="Arial" w:hAnsi="Arial"/>
+          <w:sz w:val="21"/>
+          <w:szCs w:val="21"/>
+          <w:rtl w:val="0"/>
+        </w:rPr>
+        <w:tab/>
+        <w:t xml:space="preserve">                                                                                         Cleveland, OH</w:t>
+      </w:r>
+    </w:p>
+    <w:p>
+      <w:pPr>
+        <w:pBdr>
+          <w:bottom w:color="000000" w:space="1" w:sz="6" w:val="single"/>
+        </w:pBdr>
+        <w:tabs>
+          <w:tab w:val="left" w:leader="none" w:pos="900"/>
+        </w:tabs>
+        <w:rPr>
+          <w:rFonts w:ascii="Arial" w:cs="Arial" w:eastAsia="Arial" w:hAnsi="Arial"/>
+          <w:sz w:val="21"/>
+          <w:szCs w:val="21"/>
+        </w:rPr>
+      </w:pPr>
+      <w:r>
+        <w:rPr>
+          <w:rFonts w:ascii="Arial" w:cs="Arial" w:eastAsia="Arial" w:hAnsi="Arial"/>
+          <w:sz w:val="21"/>
+          <w:szCs w:val="21"/>
+          <w:rtl w:val="0"/>
+        </w:rPr>
+        <w:t xml:space="preserve">Masters in Computer Software Engineering</w:t>
+        <w:tab/>
+        <w:t xml:space="preserve">                                                                    AUG 2023 – MAY 2025</w:t>
+      </w:r>
+    </w:p>
+    <w:p>
+      <w:pPr>
+        <w:pBdr>
+          <w:bottom w:color="000000" w:space="1" w:sz="6" w:val="single"/>
+        </w:pBdr>
+        <w:tabs>
+          <w:tab w:val="left" w:leader="none" w:pos="900"/>
+        </w:tabs>
+        <w:rPr>
+          <w:rFonts w:ascii="Arial" w:cs="Arial" w:eastAsia="Arial" w:hAnsi="Arial"/>
+          <w:sz w:val="21"/>
+          <w:szCs w:val="21"/>
+        </w:rPr>
+      </w:pPr>
+      <w:r>
+        <w:rPr>
+          <w:rFonts w:ascii="Arial" w:cs="Arial" w:eastAsia="Arial" w:hAnsi="Arial"/>
+          <w:sz w:val="21"/>
+          <w:szCs w:val="21"/>
+          <w:rtl w:val="0"/>
+        </w:rPr>
+        <w:t xml:space="preserve">Cumulative GPA: 3.7/4.0</w:t>
+      </w:r>
+    </w:p>
+    <w:p>
+      <w:pPr>
+        <w:pBdr>
+          <w:bottom w:color="000000" w:space="1" w:sz="6" w:val="single"/>
+        </w:pBdr>
+        <w:tabs>
+          <w:tab w:val="left" w:leader="none" w:pos="900"/>
+        </w:tabs>
+        <w:rPr>
+          <w:rFonts w:ascii="Arial" w:cs="Arial" w:eastAsia="Arial" w:hAnsi="Arial"/>
+          <w:b w:val="1"/>
+          <w:sz w:val="21"/>
+          <w:szCs w:val="21"/>
+        </w:rPr>
+      </w:pPr>
+      <w:r>
+        <w:rPr>
+          <w:rFonts w:ascii="Arial" w:cs="Arial" w:eastAsia="Arial" w:hAnsi="Arial"/>
+          <w:sz w:val="21"/>
+          <w:szCs w:val="21"/>
+          <w:rtl w:val="0"/>
+        </w:rPr>
+        <w:t xml:space="preserve">Relevant Coursework: Software Engineering, Operating Systems, Computer Networks II, Database Systems</w:t>
+      </w:r>
+      <w:r>
+        <w:rPr>
+          <w:rtl w:val="0"/>
+        </w:rPr>
+      </w:r>
+    </w:p>
+    <w:p>
+      <w:pPr>
+        <w:pBdr>
+          <w:bottom w:color="000000" w:space="1" w:sz="6" w:val="single"/>
+        </w:pBdr>
+        <w:tabs>
+          <w:tab w:val="left" w:leader="none" w:pos="900"/>
+        </w:tabs>
+        <w:rPr>
+          <w:rFonts w:ascii="Arial" w:cs="Arial" w:eastAsia="Arial" w:hAnsi="Arial"/>
+          <w:sz w:val="12"/>
+          <w:szCs w:val="12"/>
+        </w:rPr>
+      </w:pPr>
+      <w:r>
+        <w:rPr>
+          <w:rtl w:val="0"/>
+        </w:rPr>
+      </w:r>
+    </w:p>
+    <w:p>
+      <w:pPr>
+        <w:pBdr>
+          <w:bottom w:color="000000" w:space="1" w:sz="6" w:val="single"/>
+        </w:pBdr>
+        <w:tabs>
+          <w:tab w:val="left" w:leader="none" w:pos="900"/>
+          <w:tab w:val="right" w:leader="none" w:pos="10503"/>
+        </w:tabs>
+        <w:rPr>
+          <w:rFonts w:ascii="Arial" w:cs="Arial" w:eastAsia="Arial" w:hAnsi="Arial"/>
+          <w:sz w:val="21"/>
+          <w:szCs w:val="21"/>
+        </w:rPr>
+      </w:pPr>
+      <w:r>
+        <w:rPr>
+          <w:rFonts w:ascii="Arial" w:cs="Arial" w:eastAsia="Arial" w:hAnsi="Arial"/>
+          <w:b w:val="1"/>
+          <w:sz w:val="21"/>
+          <w:szCs w:val="21"/>
+          <w:rtl w:val="0"/>
+        </w:rPr>
+        <w:t xml:space="preserve">SREYAS INSTITUTE OF ENGINEERING AND TECHNOLOGY - AUTONOMOUS</w:t>
+      </w:r>
+      <w:r>
+        <w:rPr>
+          <w:rFonts w:ascii="Arial" w:cs="Arial" w:eastAsia="Arial" w:hAnsi="Arial"/>
+          <w:sz w:val="21"/>
+          <w:szCs w:val="21"/>
+          <w:rtl w:val="0"/>
+        </w:rPr>
+        <w:tab/>
+        <w:t xml:space="preserve">Hyderabad, TS, INDIA</w:t>
+      </w:r>
+    </w:p>
+    <w:p>
+      <w:pPr>
+        <w:pBdr>
+          <w:bottom w:color="000000" w:space="1" w:sz="6" w:val="single"/>
+        </w:pBdr>
+        <w:tabs>
+          <w:tab w:val="left" w:leader="none" w:pos="900"/>
+        </w:tabs>
+        <w:rPr>
+          <w:rFonts w:ascii="Arial" w:cs="Arial" w:eastAsia="Arial" w:hAnsi="Arial"/>
+          <w:sz w:val="21"/>
+          <w:szCs w:val="21"/>
+        </w:rPr>
+      </w:pPr>
+      <w:r>
+        <w:rPr>
+          <w:rFonts w:ascii="Arial" w:cs="Arial" w:eastAsia="Arial" w:hAnsi="Arial"/>
+          <w:sz w:val="21"/>
+          <w:szCs w:val="21"/>
+          <w:rtl w:val="0"/>
+        </w:rPr>
+        <w:t xml:space="preserve">Bachelor of Technology in Computer Science</w:t>
+        <w:tab/>
+        <w:t xml:space="preserve">                                                                 AUG 2018 – JUL 2022</w:t>
+      </w:r>
+    </w:p>
+    <w:p>
+      <w:pPr>
+        <w:pBdr>
+          <w:bottom w:color="000000" w:space="1" w:sz="6" w:val="single"/>
+        </w:pBdr>
+        <w:tabs>
+          <w:tab w:val="left" w:leader="none" w:pos="900"/>
+        </w:tabs>
+        <w:rPr>
+          <w:rFonts w:ascii="Arial" w:cs="Arial" w:eastAsia="Arial" w:hAnsi="Arial"/>
+          <w:sz w:val="21"/>
+          <w:szCs w:val="21"/>
+        </w:rPr>
+      </w:pPr>
+      <w:r>
+        <w:rPr>
+          <w:rFonts w:ascii="Arial" w:cs="Arial" w:eastAsia="Arial" w:hAnsi="Arial"/>
+          <w:sz w:val="21"/>
+          <w:szCs w:val="21"/>
+          <w:rtl w:val="0"/>
+        </w:rPr>
+        <w:t xml:space="preserve">Cumulative GPA: 3.7/4.0</w:t>
+      </w:r>
+    </w:p>
+    <w:p>
+      <w:pPr>
+        <w:pBdr>
+          <w:bottom w:color="000000" w:space="1" w:sz="6" w:val="single"/>
+        </w:pBdr>
+        <w:tabs>
+          <w:tab w:val="left" w:leader="none" w:pos="900"/>
+        </w:tabs>
+        <w:rPr>
+          <w:rFonts w:ascii="Arial" w:cs="Arial" w:eastAsia="Arial" w:hAnsi="Arial"/>
+          <w:sz w:val="21"/>
+          <w:szCs w:val="21"/>
+        </w:rPr>
+      </w:pPr>
+      <w:r>
+        <w:rPr>
+          <w:rFonts w:ascii="Arial" w:cs="Arial" w:eastAsia="Arial" w:hAnsi="Arial"/>
+          <w:sz w:val="21"/>
+          <w:szCs w:val="21"/>
+          <w:rtl w:val="0"/>
+        </w:rPr>
+        <w:t xml:space="preserve">Relevant Coursework: Software Engineering, Operating Systems, Computer Networks II, Database Systems</w:t>
+      </w:r>
+    </w:p>
+    <w:p>
+      <w:pPr>
+        <w:pBdr>
+          <w:bottom w:color="000000" w:space="1" w:sz="6" w:val="single"/>
+        </w:pBdr>
+        <w:tabs>
+          <w:tab w:val="left" w:leader="none" w:pos="900"/>
+        </w:tabs>
+        <w:rPr>
+          <w:rFonts w:ascii="Arial" w:cs="Arial" w:eastAsia="Arial" w:hAnsi="Arial"/>
+          <w:b w:val="0"/>
+          <w:color w:val="ff0000"/>
+          <w:sz w:val="21"/>
+          <w:szCs w:val="21"/>
+          <w:vertAlign w:val="baseline"/>
         </w:rPr>
       </w:pPr>
       <w:r>

</xml_diff>

<commit_message>
Add autopilotmode project and support secondary project links
Feature the autopilotmode computer-use agent as a project card with its
own screenshot and live site link. Project cards now render an optional
site link alongside the GitHub link, wrapped in a .proj-links flex row.
Also refreshes the resume document.

Co-Authored-By: Claude Opus 5 (1M context) <noreply@anthropic.com>
</commit_message>
<xml_diff>
--- a/Vishal_Yadav_Chatharasi_Resume.docx
+++ b/Vishal_Yadav_Chatharasi_Resume.docx
@@ -1175,6 +1175,134 @@
           <w:rtl w:val="0"/>
         </w:rPr>
         <w:tab/>
+      </w:r>
+    </w:p>
+    <w:p>
+      <w:pPr>
+        <w:tabs>
+          <w:tab w:val="left" w:leader="none" w:pos="1134"/>
+          <w:tab w:val="right" w:leader="none" w:pos="10503"/>
+        </w:tabs>
+        <w:spacing w:after="240" w:before="240" w:lineRule="auto"/>
+        <w:rPr>
+          <w:sz w:val="22"/>
+          <w:szCs w:val="22"/>
+        </w:rPr>
+      </w:pPr>
+      <w:r>
+        <w:rPr>
+          <w:rFonts w:ascii="Arial" w:cs="Arial" w:eastAsia="Arial" w:hAnsi="Arial"/>
+          <w:b w:val="1"/>
+          <w:sz w:val="21"/>
+          <w:szCs w:val="21"/>
+          <w:rtl w:val="0"/>
+        </w:rPr>
+        <w:t xml:space="preserve">autopilotmode (</w:t>
+      </w:r>
+      <w:hyperlink r:id="rId14">
+        <w:r>
+          <w:rPr>
+            <w:rFonts w:ascii="Arial" w:cs="Arial" w:eastAsia="Arial" w:hAnsi="Arial"/>
+            <w:b w:val="1"/>
+            <w:color w:val="1155cc"/>
+            <w:sz w:val="21"/>
+            <w:szCs w:val="21"/>
+            <w:u w:val="single"/>
+            <w:rtl w:val="0"/>
+          </w:rPr>
+          <w:t xml:space="preserve">Link</w:t>
+        </w:r>
+      </w:hyperlink>
+      <w:r>
+        <w:rPr>
+          <w:rFonts w:ascii="Arial" w:cs="Arial" w:eastAsia="Arial" w:hAnsi="Arial"/>
+          <w:b w:val="1"/>
+          <w:sz w:val="21"/>
+          <w:szCs w:val="21"/>
+          <w:rtl w:val="0"/>
+        </w:rPr>
+        <w:t xml:space="preserve">)</w:t>
+      </w:r>
+      <w:r>
+        <w:rPr>
+          <w:rtl w:val="0"/>
+        </w:rPr>
+      </w:r>
+    </w:p>
+    <w:p>
+      <w:pPr>
+        <w:numPr>
+          <w:ilvl w:val="0"/>
+          <w:numId w:val="2"/>
+        </w:numPr>
+        <w:tabs>
+          <w:tab w:val="left" w:leader="none" w:pos="284"/>
+          <w:tab w:val="left" w:leader="none" w:pos="630"/>
+          <w:tab w:val="left" w:leader="none" w:pos="900"/>
+        </w:tabs>
+        <w:ind w:left="284" w:hanging="270"/>
+        <w:rPr>
+          <w:rFonts w:ascii="Noto Sans Symbols" w:cs="Noto Sans Symbols" w:eastAsia="Noto Sans Symbols" w:hAnsi="Noto Sans Symbols"/>
+          <w:sz w:val="21"/>
+          <w:szCs w:val="21"/>
+        </w:rPr>
+      </w:pPr>
+      <w:r>
+        <w:rPr>
+          <w:rFonts w:ascii="Arial" w:cs="Arial" w:eastAsia="Arial" w:hAnsi="Arial"/>
+          <w:b w:val="1"/>
+          <w:sz w:val="21"/>
+          <w:szCs w:val="21"/>
+          <w:rtl w:val="0"/>
+        </w:rPr>
+        <w:t xml:space="preserve">Screen-Grounded Computer Use</w:t>
+      </w:r>
+      <w:r>
+        <w:rPr>
+          <w:rFonts w:ascii="Arial" w:cs="Arial" w:eastAsia="Arial" w:hAnsi="Arial"/>
+          <w:sz w:val="21"/>
+          <w:szCs w:val="21"/>
+          <w:rtl w:val="0"/>
+        </w:rPr>
+        <w:t xml:space="preserve">: Hands the real mouse and keyboard to a vision model that reads the screen, takes one action, then re-checks on the next frame — recovering from moved buttons and slow loads that break scripted automation, with no selectors or per-app integrations.</w:t>
+      </w:r>
+    </w:p>
+    <w:p>
+      <w:pPr>
+        <w:numPr>
+          <w:ilvl w:val="0"/>
+          <w:numId w:val="2"/>
+        </w:numPr>
+        <w:tabs>
+          <w:tab w:val="left" w:leader="none" w:pos="284"/>
+          <w:tab w:val="left" w:leader="none" w:pos="630"/>
+          <w:tab w:val="left" w:leader="none" w:pos="900"/>
+        </w:tabs>
+        <w:ind w:left="284" w:hanging="270"/>
+        <w:rPr>
+          <w:rFonts w:ascii="Noto Sans Symbols" w:cs="Noto Sans Symbols" w:eastAsia="Noto Sans Symbols" w:hAnsi="Noto Sans Symbols"/>
+          <w:sz w:val="21"/>
+          <w:szCs w:val="21"/>
+        </w:rPr>
+      </w:pPr>
+      <w:r>
+        <w:rPr>
+          <w:rFonts w:ascii="Arial" w:cs="Arial" w:eastAsia="Arial" w:hAnsi="Arial"/>
+          <w:b w:val="1"/>
+          <w:sz w:val="21"/>
+          <w:szCs w:val="21"/>
+          <w:rtl w:val="0"/>
+        </w:rPr>
+        <w:t xml:space="preserve">Rust Desktop and CLI, Multi-Provider</w:t>
+      </w:r>
+      <w:r>
+        <w:rPr>
+          <w:rFonts w:ascii="Arial" w:cs="Arial" w:eastAsia="Arial" w:hAnsi="Arial"/>
+          <w:sz w:val="21"/>
+          <w:szCs w:val="21"/>
+          <w:rtl w:val="0"/>
+        </w:rPr>
+        <w:t xml:space="preserve">: Built in Rust with a Tauri desktop UI and a terminal client; runs on the Anthropic API or OpenRouter with live model discovery filtered to vision and tool-calling models, plus voice input and safety controls (dry-run default, failsafe abort, step caps).</w:t>
       </w:r>
     </w:p>
     <w:p>

</xml_diff>